<commit_message>
Add all authors and affiliation; fix repository links and tutor reference
</commit_message>
<xml_diff>
--- a/paper/paper.docx
+++ b/paper/paper.docx
@@ -29,7 +29,7 @@
         <w:pStyle w:val="BodyText"/>
       </w:pPr>
       <w:r>
-        <w:t xml:space="preserve">Shubhanandan</w:t>
+        <w:t>Shubhanandan T Y, Mohan V S, Bharath Kumar Shanmugam, Puneeth N</w:t>
       </w:r>
     </w:p>
     <w:p>
@@ -40,7 +40,7 @@
         <w:rPr>
           <w:rStyle w:val="VerbatimChar"/>
         </w:rPr>
-        <w:t xml:space="preserve">shubh442005@gmail.com</w:t>
+        <w:t>Department of AI &amp; Robotics, Dayananda Sagar University, Bengaluru, Karnataka, India · {shubh442005, vsmohan712, shanmugabharathkumar, puneethn0015}@gmail.com</w:t>
       </w:r>
     </w:p>
     <w:p>
@@ -1338,19 +1338,19 @@
         <w:pStyle w:val="FirstParagraph"/>
       </w:pPr>
       <w:r>
-        <w:t xml:space="preserve">Concurrent work on LLM tutors reports the same shape of error in a different setting: teacher models</w:t>
-      </w:r>
-      <w:r>
-        <w:t xml:space="preserve"> </w:t>
-      </w:r>
-      <w:r>
-        <w:t xml:space="preserve">intervene in 90% of trials against an oracle’s 54%, and do so at 18% of the way through the</w:t>
-      </w:r>
-      <w:r>
-        <w:t xml:space="preserve"> </w:t>
-      </w:r>
-      <w:r>
-        <w:t xml:space="preserve">student’s reasoning rather than 56% (Int-Bench, 2026). Interventions land early and without</w:t>
+        <w:t>Concurrent work on LLM tutors reports the same shape of error in a different setting: on the Int-Bench framework of Teo et al. (2026), teacher models in the standard condition</w:t>
+      </w:r>
+      <w:r>
+        <w:t xml:space="preserve"> </w:t>
+      </w:r>
+      <w:r>
+        <w:t>intervene in 90% of trials and do so at 18% of the way through the</w:t>
+      </w:r>
+      <w:r>
+        <w:t xml:space="preserve"> </w:t>
+      </w:r>
+      <w:r>
+        <w:t>student’s reasoning, against 54% and 56% in the oracle condition. Interventions land early and without</w:t>
       </w:r>
       <w:r>
         <w:t xml:space="preserve"> </w:t>
@@ -7066,7 +7066,652 @@
         <w:pStyle w:val="BodyText"/>
       </w:pPr>
       <w:r>
-        <w:t xml:space="preserve">AI assistants overassist: intervention timing in LLM tutors.</w:t>
+        <w:t xml:space="preserve">T. F. Jaeger.</w:t>
+      </w:r>
+      <w:r>
+        <w:t xml:space="preserve"> </w:t>
+      </w:r>
+      <w:r>
+        <w:t xml:space="preserve">Redundancy and reduction: speakers manage syntactic information density.</w:t>
+      </w:r>
+      <w:r>
+        <w:t xml:space="preserve"> </w:t>
+      </w:r>
+      <w:r>
+        <w:rPr>
+          <w:iCs/>
+          <w:i/>
+        </w:rPr>
+        <w:t xml:space="preserve">Cognitive Psychology</w:t>
+      </w:r>
+      <w:r>
+        <w:t xml:space="preserve">, 61(1):23–62, 2010.</w:t>
+      </w:r>
+    </w:p>
+    <w:p>
+      <w:pPr>
+        <w:pStyle w:val="BodyText"/>
+      </w:pPr>
+      <w:r>
+        <w:t xml:space="preserve">S. Javdani, S. Srinivasa, and J. A. Bagnell.</w:t>
+      </w:r>
+      <w:r>
+        <w:t xml:space="preserve"> </w:t>
+      </w:r>
+      <w:r>
+        <w:t xml:space="preserve">Shared autonomy via hindsight optimization.</w:t>
+      </w:r>
+      <w:r>
+        <w:t xml:space="preserve"> </w:t>
+      </w:r>
+      <w:r>
+        <w:rPr>
+          <w:iCs/>
+          <w:i/>
+        </w:rPr>
+        <w:t xml:space="preserve">Robotics: Science and Systems</w:t>
+      </w:r>
+      <w:r>
+        <w:t xml:space="preserve">, 2015.</w:t>
+      </w:r>
+    </w:p>
+    <w:p>
+      <w:pPr>
+        <w:pStyle w:val="BodyText"/>
+      </w:pPr>
+      <w:r>
+        <w:t xml:space="preserve">S. Kadavath, T. Conerly, A. Askell, et al.</w:t>
+      </w:r>
+      <w:r>
+        <w:t xml:space="preserve"> </w:t>
+      </w:r>
+      <w:r>
+        <w:t xml:space="preserve">Language models (mostly) know what they know.</w:t>
+      </w:r>
+      <w:r>
+        <w:t xml:space="preserve"> </w:t>
+      </w:r>
+      <w:r>
+        <w:rPr>
+          <w:iCs/>
+          <w:i/>
+        </w:rPr>
+        <w:t xml:space="preserve">arXiv:2207.05221</w:t>
+      </w:r>
+      <w:r>
+        <w:t xml:space="preserve">, 2022.</w:t>
+      </w:r>
+    </w:p>
+    <w:p>
+      <w:pPr>
+        <w:pStyle w:val="BodyText"/>
+      </w:pPr>
+      <w:r>
+        <w:t xml:space="preserve">A. S. Klyubin, D. Polani, and C. L. Nehaniv.</w:t>
+      </w:r>
+      <w:r>
+        <w:t xml:space="preserve"> </w:t>
+      </w:r>
+      <w:r>
+        <w:t xml:space="preserve">All else being equal be empowered.</w:t>
+      </w:r>
+      <w:r>
+        <w:t xml:space="preserve"> </w:t>
+      </w:r>
+      <w:r>
+        <w:rPr>
+          <w:iCs/>
+          <w:i/>
+        </w:rPr>
+        <w:t xml:space="preserve">European Conference on Artificial Life</w:t>
+      </w:r>
+      <w:r>
+        <w:t xml:space="preserve">, 2005.</w:t>
+      </w:r>
+    </w:p>
+    <w:p>
+      <w:pPr>
+        <w:pStyle w:val="BodyText"/>
+      </w:pPr>
+      <w:r>
+        <w:t xml:space="preserve">L. Kuhn, Y. Gal, and S. Farquhar.</w:t>
+      </w:r>
+      <w:r>
+        <w:t xml:space="preserve"> </w:t>
+      </w:r>
+      <w:r>
+        <w:t xml:space="preserve">Semantic uncertainty: linguistic invariances for uncertainty estimation in natural language</w:t>
+      </w:r>
+      <w:r>
+        <w:t xml:space="preserve"> </w:t>
+      </w:r>
+      <w:r>
+        <w:t xml:space="preserve">generation.</w:t>
+      </w:r>
+      <w:r>
+        <w:t xml:space="preserve"> </w:t>
+      </w:r>
+      <w:r>
+        <w:rPr>
+          <w:iCs/>
+          <w:i/>
+        </w:rPr>
+        <w:t xml:space="preserve">International Conference on Learning Representations</w:t>
+      </w:r>
+      <w:r>
+        <w:t xml:space="preserve">, 2023.</w:t>
+      </w:r>
+    </w:p>
+    <w:p>
+      <w:pPr>
+        <w:pStyle w:val="BodyText"/>
+      </w:pPr>
+      <w:r>
+        <w:t xml:space="preserve">R. Levy.</w:t>
+      </w:r>
+      <w:r>
+        <w:t xml:space="preserve"> </w:t>
+      </w:r>
+      <w:r>
+        <w:t xml:space="preserve">Expectation-based syntactic comprehension.</w:t>
+      </w:r>
+      <w:r>
+        <w:t xml:space="preserve"> </w:t>
+      </w:r>
+      <w:r>
+        <w:rPr>
+          <w:iCs/>
+          <w:i/>
+        </w:rPr>
+        <w:t xml:space="preserve">Cognition</w:t>
+      </w:r>
+      <w:r>
+        <w:t xml:space="preserve">, 106(3):1126–1177, 2008.</w:t>
+      </w:r>
+    </w:p>
+    <w:p>
+      <w:pPr>
+        <w:pStyle w:val="BodyText"/>
+      </w:pPr>
+      <w:r>
+        <w:t xml:space="preserve">S. Lin, J. Hilton, and O. Evans.</w:t>
+      </w:r>
+      <w:r>
+        <w:t xml:space="preserve"> </w:t>
+      </w:r>
+      <w:r>
+        <w:t xml:space="preserve">Teaching models to express their uncertainty in words.</w:t>
+      </w:r>
+      <w:r>
+        <w:t xml:space="preserve"> </w:t>
+      </w:r>
+      <w:r>
+        <w:rPr>
+          <w:iCs/>
+          <w:i/>
+        </w:rPr>
+        <w:t xml:space="preserve">Transactions on Machine Learning Research</w:t>
+      </w:r>
+      <w:r>
+        <w:t xml:space="preserve">, 2022.</w:t>
+      </w:r>
+    </w:p>
+    <w:p>
+      <w:pPr>
+        <w:pStyle w:val="BodyText"/>
+      </w:pPr>
+      <w:r>
+        <w:t xml:space="preserve">D. Madras, T. Pitassi, and R. Zemel.</w:t>
+      </w:r>
+      <w:r>
+        <w:t xml:space="preserve"> </w:t>
+      </w:r>
+      <w:r>
+        <w:t xml:space="preserve">Predict responsibly: improving fairness and accuracy by learning to defer.</w:t>
+      </w:r>
+      <w:r>
+        <w:t xml:space="preserve"> </w:t>
+      </w:r>
+      <w:r>
+        <w:rPr>
+          <w:iCs/>
+          <w:i/>
+        </w:rPr>
+        <w:t xml:space="preserve">Advances in Neural Information Processing Systems</w:t>
+      </w:r>
+      <w:r>
+        <w:t xml:space="preserve">, 2018.</w:t>
+      </w:r>
+    </w:p>
+    <w:p>
+      <w:pPr>
+        <w:pStyle w:val="BodyText"/>
+      </w:pPr>
+      <w:r>
+        <w:t xml:space="preserve">S. Mohamed and D. J. Rezende.</w:t>
+      </w:r>
+      <w:r>
+        <w:t xml:space="preserve"> </w:t>
+      </w:r>
+      <w:r>
+        <w:t xml:space="preserve">Variational information maximisation for intrinsically motivated reinforcement learning.</w:t>
+      </w:r>
+      <w:r>
+        <w:t xml:space="preserve"> </w:t>
+      </w:r>
+      <w:r>
+        <w:rPr>
+          <w:iCs/>
+          <w:i/>
+        </w:rPr>
+        <w:t xml:space="preserve">Advances in Neural Information Processing Systems</w:t>
+      </w:r>
+      <w:r>
+        <w:t xml:space="preserve">, 2015.</w:t>
+      </w:r>
+    </w:p>
+    <w:p>
+      <w:pPr>
+        <w:pStyle w:val="BodyText"/>
+      </w:pPr>
+      <w:r>
+        <w:t xml:space="preserve">H. Mozannar and D. Sontag.</w:t>
+      </w:r>
+      <w:r>
+        <w:t xml:space="preserve"> </w:t>
+      </w:r>
+      <w:r>
+        <w:t xml:space="preserve">Consistent estimators for learning to defer to an expert.</w:t>
+      </w:r>
+      <w:r>
+        <w:t xml:space="preserve"> </w:t>
+      </w:r>
+      <w:r>
+        <w:rPr>
+          <w:iCs/>
+          <w:i/>
+        </w:rPr>
+        <w:t xml:space="preserve">International Conference on Machine Learning</w:t>
+      </w:r>
+      <w:r>
+        <w:t xml:space="preserve">, 2020.</w:t>
+      </w:r>
+    </w:p>
+    <w:p>
+      <w:pPr>
+        <w:pStyle w:val="BodyText"/>
+      </w:pPr>
+      <w:r>
+        <w:t xml:space="preserve">H. Mozannar, V. Chen, M. Alsobay, et al.</w:t>
+      </w:r>
+      <w:r>
+        <w:t xml:space="preserve"> </w:t>
+      </w:r>
+      <w:r>
+        <w:t xml:space="preserve">The RealHumanEval: evaluating large language models’ abilities to support programmers.</w:t>
+      </w:r>
+      <w:r>
+        <w:t xml:space="preserve"> </w:t>
+      </w:r>
+      <w:r>
+        <w:rPr>
+          <w:iCs/>
+          <w:i/>
+        </w:rPr>
+        <w:t xml:space="preserve">arXiv:2404.02806</w:t>
+      </w:r>
+      <w:r>
+        <w:t xml:space="preserve">, 2024.</w:t>
+      </w:r>
+    </w:p>
+    <w:p>
+      <w:pPr>
+        <w:pStyle w:val="BodyText"/>
+      </w:pPr>
+      <w:r>
+        <w:t xml:space="preserve">V. Myers, E. Ellis, S. Levine, B. Eysenbach, and A. Dragan.</w:t>
+      </w:r>
+      <w:r>
+        <w:t xml:space="preserve"> </w:t>
+      </w:r>
+      <w:r>
+        <w:t xml:space="preserve">Learning to assist humans without inferring rewards.</w:t>
+      </w:r>
+      <w:r>
+        <w:t xml:space="preserve"> </w:t>
+      </w:r>
+      <w:r>
+        <w:rPr>
+          <w:iCs/>
+          <w:i/>
+        </w:rPr>
+        <w:t xml:space="preserve">Advances in Neural Information Processing Systems</w:t>
+      </w:r>
+      <w:r>
+        <w:t xml:space="preserve">, 2024.</w:t>
+      </w:r>
+    </w:p>
+    <w:p>
+      <w:pPr>
+        <w:pStyle w:val="BodyText"/>
+      </w:pPr>
+      <w:r>
+        <w:t xml:space="preserve">R. Parasuraman and V. Riley.</w:t>
+      </w:r>
+      <w:r>
+        <w:t xml:space="preserve"> </w:t>
+      </w:r>
+      <w:r>
+        <w:t xml:space="preserve">Humans and automation: use, misuse, disuse, abuse.</w:t>
+      </w:r>
+      <w:r>
+        <w:t xml:space="preserve"> </w:t>
+      </w:r>
+      <w:r>
+        <w:rPr>
+          <w:iCs/>
+          <w:i/>
+        </w:rPr>
+        <w:t xml:space="preserve">Human Factors</w:t>
+      </w:r>
+      <w:r>
+        <w:t xml:space="preserve">, 39(2):230–253, 1997.</w:t>
+      </w:r>
+    </w:p>
+    <w:p>
+      <w:pPr>
+        <w:pStyle w:val="BodyText"/>
+      </w:pPr>
+      <w:r>
+        <w:t xml:space="preserve">H. Pearce, B. Ahmad, B. Tan, B. Dolan-Gavitt, and R. Karri.</w:t>
+      </w:r>
+      <w:r>
+        <w:t xml:space="preserve"> </w:t>
+      </w:r>
+      <w:r>
+        <w:t xml:space="preserve">Asleep at the keyboard? Assessing the security of GitHub Copilot’s code contributions.</w:t>
+      </w:r>
+      <w:r>
+        <w:t xml:space="preserve"> </w:t>
+      </w:r>
+      <w:r>
+        <w:rPr>
+          <w:iCs/>
+          <w:i/>
+        </w:rPr>
+        <w:t xml:space="preserve">IEEE Symposium on Security and Privacy</w:t>
+      </w:r>
+      <w:r>
+        <w:t xml:space="preserve">, 2022.</w:t>
+      </w:r>
+    </w:p>
+    <w:p>
+      <w:pPr>
+        <w:pStyle w:val="BodyText"/>
+      </w:pPr>
+      <w:r>
+        <w:t xml:space="preserve">N. Perry, M. Srivastava, D. Kumar, and D. Boneh.</w:t>
+      </w:r>
+      <w:r>
+        <w:t xml:space="preserve"> </w:t>
+      </w:r>
+      <w:r>
+        <w:t xml:space="preserve">Do users write more insecure code with AI assistants?</w:t>
+      </w:r>
+      <w:r>
+        <w:t xml:space="preserve"> </w:t>
+      </w:r>
+      <w:r>
+        <w:rPr>
+          <w:iCs/>
+          <w:i/>
+        </w:rPr>
+        <w:t xml:space="preserve">ACM SIGSAC Conference on Computer and Communications Security</w:t>
+      </w:r>
+      <w:r>
+        <w:t xml:space="preserve">, 2023.</w:t>
+      </w:r>
+    </w:p>
+    <w:p>
+      <w:pPr>
+        <w:pStyle w:val="BodyText"/>
+      </w:pPr>
+      <w:r>
+        <w:t xml:space="preserve">M. Raghu, K. Blumer, G. Corrado, J. Kleinberg, Z. Obermeyer, and S. Mullainathan.</w:t>
+      </w:r>
+      <w:r>
+        <w:t xml:space="preserve"> </w:t>
+      </w:r>
+      <w:r>
+        <w:t xml:space="preserve">The algorithmic automation problem: prediction, triage, and human effort.</w:t>
+      </w:r>
+      <w:r>
+        <w:t xml:space="preserve"> </w:t>
+      </w:r>
+      <w:r>
+        <w:rPr>
+          <w:iCs/>
+          <w:i/>
+        </w:rPr>
+        <w:t xml:space="preserve">arXiv:1903.12220</w:t>
+      </w:r>
+      <w:r>
+        <w:t xml:space="preserve">, 2019.</w:t>
+      </w:r>
+    </w:p>
+    <w:p>
+      <w:pPr>
+        <w:pStyle w:val="BodyText"/>
+      </w:pPr>
+      <w:r>
+        <w:t xml:space="preserve">S. Reddy, A. D. Dragan, and S. Levine.</w:t>
+      </w:r>
+      <w:r>
+        <w:t xml:space="preserve"> </w:t>
+      </w:r>
+      <w:r>
+        <w:t xml:space="preserve">Shared autonomy via deep reinforcement learning.</w:t>
+      </w:r>
+      <w:r>
+        <w:t xml:space="preserve"> </w:t>
+      </w:r>
+      <w:r>
+        <w:rPr>
+          <w:iCs/>
+          <w:i/>
+        </w:rPr>
+        <w:t xml:space="preserve">Robotics: Science and Systems</w:t>
+      </w:r>
+      <w:r>
+        <w:t xml:space="preserve">, 2018.</w:t>
+      </w:r>
+    </w:p>
+    <w:p>
+      <w:pPr>
+        <w:pStyle w:val="BodyText"/>
+      </w:pPr>
+      <w:r>
+        <w:t xml:space="preserve">M. T. Ribeiro, T. Wu, C. Guestrin, and S. Singh.</w:t>
+      </w:r>
+      <w:r>
+        <w:t xml:space="preserve"> </w:t>
+      </w:r>
+      <w:r>
+        <w:t xml:space="preserve">Beyond accuracy: behavioral testing of NLP models with CheckList.</w:t>
+      </w:r>
+      <w:r>
+        <w:t xml:space="preserve"> </w:t>
+      </w:r>
+      <w:r>
+        <w:rPr>
+          <w:iCs/>
+          <w:i/>
+        </w:rPr>
+        <w:t xml:space="preserve">Annual Meeting of the Association for Computational Linguistics</w:t>
+      </w:r>
+      <w:r>
+        <w:t xml:space="preserve">, 2020.</w:t>
+      </w:r>
+    </w:p>
+    <w:p>
+      <w:pPr>
+        <w:pStyle w:val="BodyText"/>
+      </w:pPr>
+      <w:r>
+        <w:t xml:space="preserve">C. Salge, C. Glackin, and D. Polani.</w:t>
+      </w:r>
+      <w:r>
+        <w:t xml:space="preserve"> </w:t>
+      </w:r>
+      <w:r>
+        <w:t xml:space="preserve">Empowerment: an introduction.</w:t>
+      </w:r>
+      <w:r>
+        <w:t xml:space="preserve"> </w:t>
+      </w:r>
+      <w:r>
+        <w:t xml:space="preserve">In</w:t>
+      </w:r>
+      <w:r>
+        <w:t xml:space="preserve"> </w:t>
+      </w:r>
+      <w:r>
+        <w:rPr>
+          <w:iCs/>
+          <w:i/>
+        </w:rPr>
+        <w:t xml:space="preserve">Guided Self-Organization: Inception</w:t>
+      </w:r>
+      <w:r>
+        <w:t xml:space="preserve">, pages 67–114. Springer, 2014.</w:t>
+      </w:r>
+    </w:p>
+    <w:p>
+      <w:pPr>
+        <w:pStyle w:val="BodyText"/>
+      </w:pPr>
+      <w:r>
+        <w:t xml:space="preserve">G. Sandoval, H. Pearce, T. Nys, R. Karri, S. Garg, and B. Dolan-Gavitt.</w:t>
+      </w:r>
+      <w:r>
+        <w:t xml:space="preserve"> </w:t>
+      </w:r>
+      <w:r>
+        <w:t xml:space="preserve">Lost at C: a user study on the security implications of large language model code assistants.</w:t>
+      </w:r>
+      <w:r>
+        <w:t xml:space="preserve"> </w:t>
+      </w:r>
+      <w:r>
+        <w:rPr>
+          <w:iCs/>
+          <w:i/>
+        </w:rPr>
+        <w:t xml:space="preserve">USENIX Security Symposium</w:t>
+      </w:r>
+      <w:r>
+        <w:t xml:space="preserve">, 2023.</w:t>
+      </w:r>
+    </w:p>
+    <w:p>
+      <w:pPr>
+        <w:pStyle w:val="BodyText"/>
+      </w:pPr>
+      <w:r>
+        <w:t xml:space="preserve">M. L. Siddiq and J. C. S. Santos.</w:t>
+      </w:r>
+      <w:r>
+        <w:t xml:space="preserve"> </w:t>
+      </w:r>
+      <w:r>
+        <w:t xml:space="preserve">SecurityEval dataset: mining vulnerability examples to evaluate machine learning-based code</w:t>
+      </w:r>
+      <w:r>
+        <w:t xml:space="preserve"> </w:t>
+      </w:r>
+      <w:r>
+        <w:t xml:space="preserve">generation techniques.</w:t>
+      </w:r>
+      <w:r>
+        <w:t xml:space="preserve"> </w:t>
+      </w:r>
+      <w:r>
+        <w:rPr>
+          <w:iCs/>
+          <w:i/>
+        </w:rPr>
+        <w:t xml:space="preserve">International Workshop on Mining Software Repositories Applications for Privacy and Security</w:t>
+      </w:r>
+      <w:r>
+        <w:t xml:space="preserve">,</w:t>
+      </w:r>
+      <w:r>
+        <w:t xml:space="preserve"> </w:t>
+      </w:r>
+      <w:r>
+        <w:t xml:space="preserve">2022.</w:t>
+      </w:r>
+    </w:p>
+    <w:p>
+      <w:pPr>
+        <w:pStyle w:val="BodyText"/>
+      </w:pPr>
+      <w:r>
+        <w:t xml:space="preserve">L. J. Skitka, K. L. Mosier, and M. Burdick.</w:t>
+      </w:r>
+      <w:r>
+        <w:t xml:space="preserve"> </w:t>
+      </w:r>
+      <w:r>
+        <w:t xml:space="preserve">Does automation bias decision-making?</w:t>
+      </w:r>
+      <w:r>
+        <w:t xml:space="preserve"> </w:t>
+      </w:r>
+      <w:r>
+        <w:rPr>
+          <w:iCs/>
+          <w:i/>
+        </w:rPr>
+        <w:t xml:space="preserve">International Journal of Human-Computer Studies</w:t>
+      </w:r>
+      <w:r>
+        <w:t xml:space="preserve">, 51(5):991–1006, 1999.</w:t>
+      </w:r>
+    </w:p>
+    <w:p>
+      <w:pPr>
+        <w:pStyle w:val="BodyText"/>
+      </w:pPr>
+      <w:r>
+        <w:t xml:space="preserve">N. J. Smith and R. Levy.</w:t>
+      </w:r>
+      <w:r>
+        <w:t xml:space="preserve"> </w:t>
+      </w:r>
+      <w:r>
+        <w:t xml:space="preserve">The effect of word predictability on reading time is logarithmic.</w:t>
+      </w:r>
+      <w:r>
+        <w:t xml:space="preserve"> </w:t>
+      </w:r>
+      <w:r>
+        <w:rPr>
+          <w:iCs/>
+          <w:i/>
+        </w:rPr>
+        <w:t xml:space="preserve">Cognition</w:t>
+      </w:r>
+      <w:r>
+        <w:t xml:space="preserve">, 128(3):302–319, 2013.</w:t>
+      </w:r>
+    </w:p>
+    <w:p>
+      <w:pPr>
+        <w:pStyle w:val="BodyText"/>
+      </w:pPr>
+      <w:r>
+        <w:t>V. Teo, R. Jain, T. Gerstenberg, and M. Kleiman-Weiner. AI assistants overassist.</w:t>
       </w:r>
       <w:r>
         <w:t xml:space="preserve"> </w:t>
@@ -7080,651 +7725,6 @@
       </w:r>
       <w:r>
         <w:t xml:space="preserve">, 2026.</w:t>
-      </w:r>
-    </w:p>
-    <w:p>
-      <w:pPr>
-        <w:pStyle w:val="BodyText"/>
-      </w:pPr>
-      <w:r>
-        <w:t xml:space="preserve">T. F. Jaeger.</w:t>
-      </w:r>
-      <w:r>
-        <w:t xml:space="preserve"> </w:t>
-      </w:r>
-      <w:r>
-        <w:t xml:space="preserve">Redundancy and reduction: speakers manage syntactic information density.</w:t>
-      </w:r>
-      <w:r>
-        <w:t xml:space="preserve"> </w:t>
-      </w:r>
-      <w:r>
-        <w:rPr>
-          <w:iCs/>
-          <w:i/>
-        </w:rPr>
-        <w:t xml:space="preserve">Cognitive Psychology</w:t>
-      </w:r>
-      <w:r>
-        <w:t xml:space="preserve">, 61(1):23–62, 2010.</w:t>
-      </w:r>
-    </w:p>
-    <w:p>
-      <w:pPr>
-        <w:pStyle w:val="BodyText"/>
-      </w:pPr>
-      <w:r>
-        <w:t xml:space="preserve">S. Javdani, S. Srinivasa, and J. A. Bagnell.</w:t>
-      </w:r>
-      <w:r>
-        <w:t xml:space="preserve"> </w:t>
-      </w:r>
-      <w:r>
-        <w:t xml:space="preserve">Shared autonomy via hindsight optimization.</w:t>
-      </w:r>
-      <w:r>
-        <w:t xml:space="preserve"> </w:t>
-      </w:r>
-      <w:r>
-        <w:rPr>
-          <w:iCs/>
-          <w:i/>
-        </w:rPr>
-        <w:t xml:space="preserve">Robotics: Science and Systems</w:t>
-      </w:r>
-      <w:r>
-        <w:t xml:space="preserve">, 2015.</w:t>
-      </w:r>
-    </w:p>
-    <w:p>
-      <w:pPr>
-        <w:pStyle w:val="BodyText"/>
-      </w:pPr>
-      <w:r>
-        <w:t xml:space="preserve">S. Kadavath, T. Conerly, A. Askell, et al.</w:t>
-      </w:r>
-      <w:r>
-        <w:t xml:space="preserve"> </w:t>
-      </w:r>
-      <w:r>
-        <w:t xml:space="preserve">Language models (mostly) know what they know.</w:t>
-      </w:r>
-      <w:r>
-        <w:t xml:space="preserve"> </w:t>
-      </w:r>
-      <w:r>
-        <w:rPr>
-          <w:iCs/>
-          <w:i/>
-        </w:rPr>
-        <w:t xml:space="preserve">arXiv:2207.05221</w:t>
-      </w:r>
-      <w:r>
-        <w:t xml:space="preserve">, 2022.</w:t>
-      </w:r>
-    </w:p>
-    <w:p>
-      <w:pPr>
-        <w:pStyle w:val="BodyText"/>
-      </w:pPr>
-      <w:r>
-        <w:t xml:space="preserve">A. S. Klyubin, D. Polani, and C. L. Nehaniv.</w:t>
-      </w:r>
-      <w:r>
-        <w:t xml:space="preserve"> </w:t>
-      </w:r>
-      <w:r>
-        <w:t xml:space="preserve">All else being equal be empowered.</w:t>
-      </w:r>
-      <w:r>
-        <w:t xml:space="preserve"> </w:t>
-      </w:r>
-      <w:r>
-        <w:rPr>
-          <w:iCs/>
-          <w:i/>
-        </w:rPr>
-        <w:t xml:space="preserve">European Conference on Artificial Life</w:t>
-      </w:r>
-      <w:r>
-        <w:t xml:space="preserve">, 2005.</w:t>
-      </w:r>
-    </w:p>
-    <w:p>
-      <w:pPr>
-        <w:pStyle w:val="BodyText"/>
-      </w:pPr>
-      <w:r>
-        <w:t xml:space="preserve">L. Kuhn, Y. Gal, and S. Farquhar.</w:t>
-      </w:r>
-      <w:r>
-        <w:t xml:space="preserve"> </w:t>
-      </w:r>
-      <w:r>
-        <w:t xml:space="preserve">Semantic uncertainty: linguistic invariances for uncertainty estimation in natural language</w:t>
-      </w:r>
-      <w:r>
-        <w:t xml:space="preserve"> </w:t>
-      </w:r>
-      <w:r>
-        <w:t xml:space="preserve">generation.</w:t>
-      </w:r>
-      <w:r>
-        <w:t xml:space="preserve"> </w:t>
-      </w:r>
-      <w:r>
-        <w:rPr>
-          <w:iCs/>
-          <w:i/>
-        </w:rPr>
-        <w:t xml:space="preserve">International Conference on Learning Representations</w:t>
-      </w:r>
-      <w:r>
-        <w:t xml:space="preserve">, 2023.</w:t>
-      </w:r>
-    </w:p>
-    <w:p>
-      <w:pPr>
-        <w:pStyle w:val="BodyText"/>
-      </w:pPr>
-      <w:r>
-        <w:t xml:space="preserve">R. Levy.</w:t>
-      </w:r>
-      <w:r>
-        <w:t xml:space="preserve"> </w:t>
-      </w:r>
-      <w:r>
-        <w:t xml:space="preserve">Expectation-based syntactic comprehension.</w:t>
-      </w:r>
-      <w:r>
-        <w:t xml:space="preserve"> </w:t>
-      </w:r>
-      <w:r>
-        <w:rPr>
-          <w:iCs/>
-          <w:i/>
-        </w:rPr>
-        <w:t xml:space="preserve">Cognition</w:t>
-      </w:r>
-      <w:r>
-        <w:t xml:space="preserve">, 106(3):1126–1177, 2008.</w:t>
-      </w:r>
-    </w:p>
-    <w:p>
-      <w:pPr>
-        <w:pStyle w:val="BodyText"/>
-      </w:pPr>
-      <w:r>
-        <w:t xml:space="preserve">S. Lin, J. Hilton, and O. Evans.</w:t>
-      </w:r>
-      <w:r>
-        <w:t xml:space="preserve"> </w:t>
-      </w:r>
-      <w:r>
-        <w:t xml:space="preserve">Teaching models to express their uncertainty in words.</w:t>
-      </w:r>
-      <w:r>
-        <w:t xml:space="preserve"> </w:t>
-      </w:r>
-      <w:r>
-        <w:rPr>
-          <w:iCs/>
-          <w:i/>
-        </w:rPr>
-        <w:t xml:space="preserve">Transactions on Machine Learning Research</w:t>
-      </w:r>
-      <w:r>
-        <w:t xml:space="preserve">, 2022.</w:t>
-      </w:r>
-    </w:p>
-    <w:p>
-      <w:pPr>
-        <w:pStyle w:val="BodyText"/>
-      </w:pPr>
-      <w:r>
-        <w:t xml:space="preserve">D. Madras, T. Pitassi, and R. Zemel.</w:t>
-      </w:r>
-      <w:r>
-        <w:t xml:space="preserve"> </w:t>
-      </w:r>
-      <w:r>
-        <w:t xml:space="preserve">Predict responsibly: improving fairness and accuracy by learning to defer.</w:t>
-      </w:r>
-      <w:r>
-        <w:t xml:space="preserve"> </w:t>
-      </w:r>
-      <w:r>
-        <w:rPr>
-          <w:iCs/>
-          <w:i/>
-        </w:rPr>
-        <w:t xml:space="preserve">Advances in Neural Information Processing Systems</w:t>
-      </w:r>
-      <w:r>
-        <w:t xml:space="preserve">, 2018.</w:t>
-      </w:r>
-    </w:p>
-    <w:p>
-      <w:pPr>
-        <w:pStyle w:val="BodyText"/>
-      </w:pPr>
-      <w:r>
-        <w:t xml:space="preserve">S. Mohamed and D. J. Rezende.</w:t>
-      </w:r>
-      <w:r>
-        <w:t xml:space="preserve"> </w:t>
-      </w:r>
-      <w:r>
-        <w:t xml:space="preserve">Variational information maximisation for intrinsically motivated reinforcement learning.</w:t>
-      </w:r>
-      <w:r>
-        <w:t xml:space="preserve"> </w:t>
-      </w:r>
-      <w:r>
-        <w:rPr>
-          <w:iCs/>
-          <w:i/>
-        </w:rPr>
-        <w:t xml:space="preserve">Advances in Neural Information Processing Systems</w:t>
-      </w:r>
-      <w:r>
-        <w:t xml:space="preserve">, 2015.</w:t>
-      </w:r>
-    </w:p>
-    <w:p>
-      <w:pPr>
-        <w:pStyle w:val="BodyText"/>
-      </w:pPr>
-      <w:r>
-        <w:t xml:space="preserve">H. Mozannar and D. Sontag.</w:t>
-      </w:r>
-      <w:r>
-        <w:t xml:space="preserve"> </w:t>
-      </w:r>
-      <w:r>
-        <w:t xml:space="preserve">Consistent estimators for learning to defer to an expert.</w:t>
-      </w:r>
-      <w:r>
-        <w:t xml:space="preserve"> </w:t>
-      </w:r>
-      <w:r>
-        <w:rPr>
-          <w:iCs/>
-          <w:i/>
-        </w:rPr>
-        <w:t xml:space="preserve">International Conference on Machine Learning</w:t>
-      </w:r>
-      <w:r>
-        <w:t xml:space="preserve">, 2020.</w:t>
-      </w:r>
-    </w:p>
-    <w:p>
-      <w:pPr>
-        <w:pStyle w:val="BodyText"/>
-      </w:pPr>
-      <w:r>
-        <w:t xml:space="preserve">H. Mozannar, V. Chen, M. Alsobay, et al.</w:t>
-      </w:r>
-      <w:r>
-        <w:t xml:space="preserve"> </w:t>
-      </w:r>
-      <w:r>
-        <w:t xml:space="preserve">The RealHumanEval: evaluating large language models’ abilities to support programmers.</w:t>
-      </w:r>
-      <w:r>
-        <w:t xml:space="preserve"> </w:t>
-      </w:r>
-      <w:r>
-        <w:rPr>
-          <w:iCs/>
-          <w:i/>
-        </w:rPr>
-        <w:t xml:space="preserve">arXiv:2404.02806</w:t>
-      </w:r>
-      <w:r>
-        <w:t xml:space="preserve">, 2024.</w:t>
-      </w:r>
-    </w:p>
-    <w:p>
-      <w:pPr>
-        <w:pStyle w:val="BodyText"/>
-      </w:pPr>
-      <w:r>
-        <w:t xml:space="preserve">V. Myers, E. Ellis, S. Levine, B. Eysenbach, and A. Dragan.</w:t>
-      </w:r>
-      <w:r>
-        <w:t xml:space="preserve"> </w:t>
-      </w:r>
-      <w:r>
-        <w:t xml:space="preserve">Learning to assist humans without inferring rewards.</w:t>
-      </w:r>
-      <w:r>
-        <w:t xml:space="preserve"> </w:t>
-      </w:r>
-      <w:r>
-        <w:rPr>
-          <w:iCs/>
-          <w:i/>
-        </w:rPr>
-        <w:t xml:space="preserve">Advances in Neural Information Processing Systems</w:t>
-      </w:r>
-      <w:r>
-        <w:t xml:space="preserve">, 2024.</w:t>
-      </w:r>
-    </w:p>
-    <w:p>
-      <w:pPr>
-        <w:pStyle w:val="BodyText"/>
-      </w:pPr>
-      <w:r>
-        <w:t xml:space="preserve">R. Parasuraman and V. Riley.</w:t>
-      </w:r>
-      <w:r>
-        <w:t xml:space="preserve"> </w:t>
-      </w:r>
-      <w:r>
-        <w:t xml:space="preserve">Humans and automation: use, misuse, disuse, abuse.</w:t>
-      </w:r>
-      <w:r>
-        <w:t xml:space="preserve"> </w:t>
-      </w:r>
-      <w:r>
-        <w:rPr>
-          <w:iCs/>
-          <w:i/>
-        </w:rPr>
-        <w:t xml:space="preserve">Human Factors</w:t>
-      </w:r>
-      <w:r>
-        <w:t xml:space="preserve">, 39(2):230–253, 1997.</w:t>
-      </w:r>
-    </w:p>
-    <w:p>
-      <w:pPr>
-        <w:pStyle w:val="BodyText"/>
-      </w:pPr>
-      <w:r>
-        <w:t xml:space="preserve">H. Pearce, B. Ahmad, B. Tan, B. Dolan-Gavitt, and R. Karri.</w:t>
-      </w:r>
-      <w:r>
-        <w:t xml:space="preserve"> </w:t>
-      </w:r>
-      <w:r>
-        <w:t xml:space="preserve">Asleep at the keyboard? Assessing the security of GitHub Copilot’s code contributions.</w:t>
-      </w:r>
-      <w:r>
-        <w:t xml:space="preserve"> </w:t>
-      </w:r>
-      <w:r>
-        <w:rPr>
-          <w:iCs/>
-          <w:i/>
-        </w:rPr>
-        <w:t xml:space="preserve">IEEE Symposium on Security and Privacy</w:t>
-      </w:r>
-      <w:r>
-        <w:t xml:space="preserve">, 2022.</w:t>
-      </w:r>
-    </w:p>
-    <w:p>
-      <w:pPr>
-        <w:pStyle w:val="BodyText"/>
-      </w:pPr>
-      <w:r>
-        <w:t xml:space="preserve">N. Perry, M. Srivastava, D. Kumar, and D. Boneh.</w:t>
-      </w:r>
-      <w:r>
-        <w:t xml:space="preserve"> </w:t>
-      </w:r>
-      <w:r>
-        <w:t xml:space="preserve">Do users write more insecure code with AI assistants?</w:t>
-      </w:r>
-      <w:r>
-        <w:t xml:space="preserve"> </w:t>
-      </w:r>
-      <w:r>
-        <w:rPr>
-          <w:iCs/>
-          <w:i/>
-        </w:rPr>
-        <w:t xml:space="preserve">ACM SIGSAC Conference on Computer and Communications Security</w:t>
-      </w:r>
-      <w:r>
-        <w:t xml:space="preserve">, 2023.</w:t>
-      </w:r>
-    </w:p>
-    <w:p>
-      <w:pPr>
-        <w:pStyle w:val="BodyText"/>
-      </w:pPr>
-      <w:r>
-        <w:t xml:space="preserve">M. Raghu, K. Blumer, G. Corrado, J. Kleinberg, Z. Obermeyer, and S. Mullainathan.</w:t>
-      </w:r>
-      <w:r>
-        <w:t xml:space="preserve"> </w:t>
-      </w:r>
-      <w:r>
-        <w:t xml:space="preserve">The algorithmic automation problem: prediction, triage, and human effort.</w:t>
-      </w:r>
-      <w:r>
-        <w:t xml:space="preserve"> </w:t>
-      </w:r>
-      <w:r>
-        <w:rPr>
-          <w:iCs/>
-          <w:i/>
-        </w:rPr>
-        <w:t xml:space="preserve">arXiv:1903.12220</w:t>
-      </w:r>
-      <w:r>
-        <w:t xml:space="preserve">, 2019.</w:t>
-      </w:r>
-    </w:p>
-    <w:p>
-      <w:pPr>
-        <w:pStyle w:val="BodyText"/>
-      </w:pPr>
-      <w:r>
-        <w:t xml:space="preserve">S. Reddy, A. D. Dragan, and S. Levine.</w:t>
-      </w:r>
-      <w:r>
-        <w:t xml:space="preserve"> </w:t>
-      </w:r>
-      <w:r>
-        <w:t xml:space="preserve">Shared autonomy via deep reinforcement learning.</w:t>
-      </w:r>
-      <w:r>
-        <w:t xml:space="preserve"> </w:t>
-      </w:r>
-      <w:r>
-        <w:rPr>
-          <w:iCs/>
-          <w:i/>
-        </w:rPr>
-        <w:t xml:space="preserve">Robotics: Science and Systems</w:t>
-      </w:r>
-      <w:r>
-        <w:t xml:space="preserve">, 2018.</w:t>
-      </w:r>
-    </w:p>
-    <w:p>
-      <w:pPr>
-        <w:pStyle w:val="BodyText"/>
-      </w:pPr>
-      <w:r>
-        <w:t xml:space="preserve">M. T. Ribeiro, T. Wu, C. Guestrin, and S. Singh.</w:t>
-      </w:r>
-      <w:r>
-        <w:t xml:space="preserve"> </w:t>
-      </w:r>
-      <w:r>
-        <w:t xml:space="preserve">Beyond accuracy: behavioral testing of NLP models with CheckList.</w:t>
-      </w:r>
-      <w:r>
-        <w:t xml:space="preserve"> </w:t>
-      </w:r>
-      <w:r>
-        <w:rPr>
-          <w:iCs/>
-          <w:i/>
-        </w:rPr>
-        <w:t xml:space="preserve">Annual Meeting of the Association for Computational Linguistics</w:t>
-      </w:r>
-      <w:r>
-        <w:t xml:space="preserve">, 2020.</w:t>
-      </w:r>
-    </w:p>
-    <w:p>
-      <w:pPr>
-        <w:pStyle w:val="BodyText"/>
-      </w:pPr>
-      <w:r>
-        <w:t xml:space="preserve">C. Salge, C. Glackin, and D. Polani.</w:t>
-      </w:r>
-      <w:r>
-        <w:t xml:space="preserve"> </w:t>
-      </w:r>
-      <w:r>
-        <w:t xml:space="preserve">Empowerment: an introduction.</w:t>
-      </w:r>
-      <w:r>
-        <w:t xml:space="preserve"> </w:t>
-      </w:r>
-      <w:r>
-        <w:t xml:space="preserve">In</w:t>
-      </w:r>
-      <w:r>
-        <w:t xml:space="preserve"> </w:t>
-      </w:r>
-      <w:r>
-        <w:rPr>
-          <w:iCs/>
-          <w:i/>
-        </w:rPr>
-        <w:t xml:space="preserve">Guided Self-Organization: Inception</w:t>
-      </w:r>
-      <w:r>
-        <w:t xml:space="preserve">, pages 67–114. Springer, 2014.</w:t>
-      </w:r>
-    </w:p>
-    <w:p>
-      <w:pPr>
-        <w:pStyle w:val="BodyText"/>
-      </w:pPr>
-      <w:r>
-        <w:t xml:space="preserve">G. Sandoval, H. Pearce, T. Nys, R. Karri, S. Garg, and B. Dolan-Gavitt.</w:t>
-      </w:r>
-      <w:r>
-        <w:t xml:space="preserve"> </w:t>
-      </w:r>
-      <w:r>
-        <w:t xml:space="preserve">Lost at C: a user study on the security implications of large language model code assistants.</w:t>
-      </w:r>
-      <w:r>
-        <w:t xml:space="preserve"> </w:t>
-      </w:r>
-      <w:r>
-        <w:rPr>
-          <w:iCs/>
-          <w:i/>
-        </w:rPr>
-        <w:t xml:space="preserve">USENIX Security Symposium</w:t>
-      </w:r>
-      <w:r>
-        <w:t xml:space="preserve">, 2023.</w:t>
-      </w:r>
-    </w:p>
-    <w:p>
-      <w:pPr>
-        <w:pStyle w:val="BodyText"/>
-      </w:pPr>
-      <w:r>
-        <w:t xml:space="preserve">M. L. Siddiq and J. C. S. Santos.</w:t>
-      </w:r>
-      <w:r>
-        <w:t xml:space="preserve"> </w:t>
-      </w:r>
-      <w:r>
-        <w:t xml:space="preserve">SecurityEval dataset: mining vulnerability examples to evaluate machine learning-based code</w:t>
-      </w:r>
-      <w:r>
-        <w:t xml:space="preserve"> </w:t>
-      </w:r>
-      <w:r>
-        <w:t xml:space="preserve">generation techniques.</w:t>
-      </w:r>
-      <w:r>
-        <w:t xml:space="preserve"> </w:t>
-      </w:r>
-      <w:r>
-        <w:rPr>
-          <w:iCs/>
-          <w:i/>
-        </w:rPr>
-        <w:t xml:space="preserve">International Workshop on Mining Software Repositories Applications for Privacy and Security</w:t>
-      </w:r>
-      <w:r>
-        <w:t xml:space="preserve">,</w:t>
-      </w:r>
-      <w:r>
-        <w:t xml:space="preserve"> </w:t>
-      </w:r>
-      <w:r>
-        <w:t xml:space="preserve">2022.</w:t>
-      </w:r>
-    </w:p>
-    <w:p>
-      <w:pPr>
-        <w:pStyle w:val="BodyText"/>
-      </w:pPr>
-      <w:r>
-        <w:t xml:space="preserve">L. J. Skitka, K. L. Mosier, and M. Burdick.</w:t>
-      </w:r>
-      <w:r>
-        <w:t xml:space="preserve"> </w:t>
-      </w:r>
-      <w:r>
-        <w:t xml:space="preserve">Does automation bias decision-making?</w:t>
-      </w:r>
-      <w:r>
-        <w:t xml:space="preserve"> </w:t>
-      </w:r>
-      <w:r>
-        <w:rPr>
-          <w:iCs/>
-          <w:i/>
-        </w:rPr>
-        <w:t xml:space="preserve">International Journal of Human-Computer Studies</w:t>
-      </w:r>
-      <w:r>
-        <w:t xml:space="preserve">, 51(5):991–1006, 1999.</w:t>
-      </w:r>
-    </w:p>
-    <w:p>
-      <w:pPr>
-        <w:pStyle w:val="BodyText"/>
-      </w:pPr>
-      <w:r>
-        <w:t xml:space="preserve">N. J. Smith and R. Levy.</w:t>
-      </w:r>
-      <w:r>
-        <w:t xml:space="preserve"> </w:t>
-      </w:r>
-      <w:r>
-        <w:t xml:space="preserve">The effect of word predictability on reading time is logarithmic.</w:t>
-      </w:r>
-      <w:r>
-        <w:t xml:space="preserve"> </w:t>
-      </w:r>
-      <w:r>
-        <w:rPr>
-          <w:iCs/>
-          <w:i/>
-        </w:rPr>
-        <w:t xml:space="preserve">Cognition</w:t>
-      </w:r>
-      <w:r>
-        <w:t xml:space="preserve">, 128(3):302–319, 2013.</w:t>
       </w:r>
     </w:p>
     <w:p>

</xml_diff>